<commit_message>
Apply author edits to the Introduction
- WHY THIS BOOK EXISTS: ten wording edits from the author's pass
  (podcasts/pundits line, salary and bonuses, profitability line,
  hire-more war cry, laurels line, 2% margins correction, stellar/
  painful, "every leader who lasts, knows", general/king order plus
  the corner-office-is-lonely close, comfort-as-warning standfirst)
- THE PENDULUM retitled DARWINIAN PENDULUM with the author's new
  natural-selection opening ("...off it goes again. Swoosh!") and
  "forty years" as a standalone standfirst
- Normalized three typos from the draft: Darwinian, "quiet before
  the storm", "so extreme"
- HTML, book PDF (250 pp) and manuscript docx (163 pp) regenerated;
  completeness audit passes (no dropped text)

Co-Authored-By: Claude Fable 5 <noreply@anthropic.com>
Claude-Session: https://claude.ai/code/session_01RZCPCe5undcwhXDEx5fTYK
</commit_message>
<xml_diff>
--- a/book/manuscript/Kings-Playbook-Manuscript.docx
+++ b/book/manuscript/Kings-Playbook-Manuscript.docx
@@ -367,7 +367,7 @@
           <w:sz w:val="22"/>
           <w:szCs w:val="22"/>
         </w:rPr>
-        <w:t xml:space="preserve">Here is what the books didn't say.</w:t>
+        <w:t xml:space="preserve">Here is what the books, the podcasts and the pundits didn't say.</w:t>
       </w:r>
     </w:p>
     <w:p>
@@ -393,7 +393,7 @@
           <w:sz w:val="22"/>
           <w:szCs w:val="22"/>
         </w:rPr>
-        <w:t xml:space="preserve">You took the title. You took the salary. You took the corner office or the Zoom background that signals you are the one in charge.</w:t>
+        <w:t xml:space="preserve">You took the title. You took the salary and bonuses. You took the corner office or the Zoom background that signals you are the one in charge.</w:t>
       </w:r>
     </w:p>
     <w:p>
@@ -458,33 +458,33 @@
           <w:sz w:val="22"/>
           <w:szCs w:val="22"/>
         </w:rPr>
-        <w:t xml:space="preserve">Business was growing at 15%; Market was down ten.</w:t>
-      </w:r>
-    </w:p>
-    <w:p>
-      <w:pPr>
-        <w:spacing w:after="140"/>
-      </w:pPr>
-      <w:r>
-        <w:rPr>
-          <w:rFonts w:ascii="Georgia" w:cs="Georgia" w:eastAsia="Georgia" w:hAnsi="Georgia"/>
-          <w:sz w:val="22"/>
-          <w:szCs w:val="22"/>
-        </w:rPr>
-        <w:t xml:space="preserve">Hiring more people was easy.</w:t>
-      </w:r>
-    </w:p>
-    <w:p>
-      <w:pPr>
-        <w:spacing w:after="140"/>
-      </w:pPr>
-      <w:r>
-        <w:rPr>
-          <w:rFonts w:ascii="Georgia" w:cs="Georgia" w:eastAsia="Georgia" w:hAnsi="Georgia"/>
-          <w:sz w:val="22"/>
-          <w:szCs w:val="22"/>
-        </w:rPr>
-        <w:t xml:space="preserve">Celebrating wins and repeating the playbook was obvious.</w:t>
+        <w:t xml:space="preserve">Business was growing at 15%; Market was down ten. Profitability was up as well.</w:t>
+      </w:r>
+    </w:p>
+    <w:p>
+      <w:pPr>
+        <w:spacing w:after="140"/>
+      </w:pPr>
+      <w:r>
+        <w:rPr>
+          <w:rFonts w:ascii="Georgia" w:cs="Georgia" w:eastAsia="Georgia" w:hAnsi="Georgia"/>
+          <w:sz w:val="22"/>
+          <w:szCs w:val="22"/>
+        </w:rPr>
+        <w:t xml:space="preserve">Hiring more people was easy. Hire more, scale fast, win, make more money!</w:t>
+      </w:r>
+    </w:p>
+    <w:p>
+      <w:pPr>
+        <w:spacing w:after="140"/>
+      </w:pPr>
+      <w:r>
+        <w:rPr>
+          <w:rFonts w:ascii="Georgia" w:cs="Georgia" w:eastAsia="Georgia" w:hAnsi="Georgia"/>
+          <w:sz w:val="22"/>
+          <w:szCs w:val="22"/>
+        </w:rPr>
+        <w:t xml:space="preserve">Celebrating wins was necessary and resting on my laurels was earned.</w:t>
       </w:r>
     </w:p>
     <w:p>
@@ -549,46 +549,46 @@
           <w:sz w:val="22"/>
           <w:szCs w:val="22"/>
         </w:rPr>
-        <w:t xml:space="preserve">Another 20% unlocked at 20% higher margins.</w:t>
-      </w:r>
-    </w:p>
-    <w:p>
-      <w:pPr>
-        <w:spacing w:after="140"/>
-      </w:pPr>
-      <w:r>
-        <w:rPr>
-          <w:rFonts w:ascii="Georgia" w:cs="Georgia" w:eastAsia="Georgia" w:hAnsi="Georgia"/>
-          <w:sz w:val="22"/>
-          <w:szCs w:val="22"/>
-        </w:rPr>
-        <w:t xml:space="preserve">The results were stellar, but the process was painful.</w:t>
-      </w:r>
-    </w:p>
-    <w:p>
-      <w:pPr>
-        <w:spacing w:after="140"/>
-      </w:pPr>
-      <w:r>
-        <w:rPr>
-          <w:rFonts w:ascii="Georgia" w:cs="Georgia" w:eastAsia="Georgia" w:hAnsi="Georgia"/>
-          <w:sz w:val="22"/>
-          <w:szCs w:val="22"/>
-        </w:rPr>
-        <w:t xml:space="preserve">Nobody tells you this in the interview. Nobody says it at the leadership offsite. Nobody puts it in the 360-degree feedback. But every leader who has lasted knows it.</w:t>
-      </w:r>
-    </w:p>
-    <w:p>
-      <w:pPr>
-        <w:spacing w:after="140"/>
-      </w:pPr>
-      <w:r>
-        <w:rPr>
-          <w:rFonts w:ascii="Georgia" w:cs="Georgia" w:eastAsia="Georgia" w:hAnsi="Georgia"/>
-          <w:sz w:val="22"/>
-          <w:szCs w:val="22"/>
-        </w:rPr>
-        <w:t xml:space="preserve">The job is not to be comfortable or be liked. The job is to be the leader, the king, the general worth following.</w:t>
+        <w:t xml:space="preserve">Another 20% unlocked at 2% higher margins.</w:t>
+      </w:r>
+    </w:p>
+    <w:p>
+      <w:pPr>
+        <w:spacing w:after="140"/>
+      </w:pPr>
+      <w:r>
+        <w:rPr>
+          <w:rFonts w:ascii="Georgia" w:cs="Georgia" w:eastAsia="Georgia" w:hAnsi="Georgia"/>
+          <w:sz w:val="22"/>
+          <w:szCs w:val="22"/>
+        </w:rPr>
+        <w:t xml:space="preserve">The results were stellar, the process painful!</w:t>
+      </w:r>
+    </w:p>
+    <w:p>
+      <w:pPr>
+        <w:spacing w:after="140"/>
+      </w:pPr>
+      <w:r>
+        <w:rPr>
+          <w:rFonts w:ascii="Georgia" w:cs="Georgia" w:eastAsia="Georgia" w:hAnsi="Georgia"/>
+          <w:sz w:val="22"/>
+          <w:szCs w:val="22"/>
+        </w:rPr>
+        <w:t xml:space="preserve">Nobody tells you this in the interview. Nobody says it at the leadership offsite. Nobody puts it in the 360-degree feedback. But every leader who lasts, knows.</w:t>
+      </w:r>
+    </w:p>
+    <w:p>
+      <w:pPr>
+        <w:spacing w:after="140"/>
+      </w:pPr>
+      <w:r>
+        <w:rPr>
+          <w:rFonts w:ascii="Georgia" w:cs="Georgia" w:eastAsia="Georgia" w:hAnsi="Georgia"/>
+          <w:sz w:val="22"/>
+          <w:szCs w:val="22"/>
+        </w:rPr>
+        <w:t xml:space="preserve">The job is not to be comfortable or be liked. The job is to be the leader, the general, the king worth following. The corner office is lonely, the medals reflect scars, the crown is burdensome.</w:t>
       </w:r>
     </w:p>
     <w:p>
@@ -604,7 +604,7 @@
           <w:sz w:val="24"/>
           <w:szCs w:val="24"/>
         </w:rPr>
-        <w:t xml:space="preserve">Leadership is not comfortable. It was never designed to be. Comfort was always the warning sign, a death knell.</w:t>
+        <w:t xml:space="preserve">Leadership is not comfortable. It was never designed to be. Comfort is a warning sign to act, the quiet before the storm, a death knell.</w:t>
       </w:r>
     </w:p>
     <w:p>
@@ -622,20 +622,36 @@
           <w:sz w:val="40"/>
           <w:szCs w:val="40"/>
         </w:rPr>
-        <w:t xml:space="preserve">THE PENDULUM</w:t>
-      </w:r>
-    </w:p>
-    <w:p>
-      <w:pPr>
-        <w:spacing w:after="140"/>
-      </w:pPr>
-      <w:r>
-        <w:rPr>
-          <w:rFonts w:ascii="Georgia" w:cs="Georgia" w:eastAsia="Georgia" w:hAnsi="Georgia"/>
-          <w:sz w:val="22"/>
-          <w:szCs w:val="22"/>
-        </w:rPr>
-        <w:t xml:space="preserve">The history of leadership theory is a history of pendulum swings. Each era produces a dominant model, elevates it to gospel, and eventually generates the conditions for its own rejection. The correction that follows is always defined by what the previous model got wrong. And because each correction overshoots, the next one is already being seeded at the moment of triumph. We have been doing this for forty years. We are still doing it now.</w:t>
+        <w:t xml:space="preserve">DARWINIAN PENDULUM</w:t>
+      </w:r>
+    </w:p>
+    <w:p>
+      <w:pPr>
+        <w:spacing w:after="140"/>
+      </w:pPr>
+      <w:r>
+        <w:rPr>
+          <w:rFonts w:ascii="Georgia" w:cs="Georgia" w:eastAsia="Georgia" w:hAnsi="Georgia"/>
+          <w:sz w:val="22"/>
+          <w:szCs w:val="22"/>
+        </w:rPr>
+        <w:t xml:space="preserve">The history of leadership theory is a history of evolution. Natural selection is often misunderstood. Changing environment does not push organisms to evolve. It creates waves and the organisms who are wired to catch those waves survive. Others fade. It's not always the strongest that survives but the fittest. Each era produces dominant waves in the fabric of socio-political-economical-cultural space, that in turn impacts what is expected of its leaders. The wave evolves, often creating pendulum swings so extreme that it eventually generates the conditions for its own rejection. The correction that follows is always defined by what the previous model got wrong. And because each correction overshoots, the next one overcorrects, finds momentary harmony and off it goes again. Swoosh!</w:t>
+      </w:r>
+    </w:p>
+    <w:p>
+      <w:pPr>
+        <w:spacing w:after="220"/>
+      </w:pPr>
+      <w:r>
+        <w:rPr>
+          <w:rFonts w:ascii="Georgia" w:cs="Georgia" w:eastAsia="Georgia" w:hAnsi="Georgia"/>
+          <w:i/>
+          <w:iCs/>
+          <w:color w:val="131347"/>
+          <w:sz w:val="24"/>
+          <w:szCs w:val="24"/>
+        </w:rPr>
+        <w:t xml:space="preserve">We have been doing this for forty years. We are still doing it now.</w:t>
       </w:r>
     </w:p>
     <w:p>

</xml_diff>

<commit_message>
Manuscript: add the back-cover blurb (164 pp)
Full-book audit at the strictest threshold found one last authored
passage outside the manuscript: the back-cover copy. Added as a final
BACK COVER section. The manuscript now contains every authored word in
the book; the only strings not carried over are viewer chrome (zoom and
edit buttons, splash, law navigator) and repeated category kicker labels.

Co-Authored-By: Claude Fable 5 <noreply@anthropic.com>
Claude-Session: https://claude.ai/code/session_01RZCPCe5undcwhXDEx5fTYK
</commit_message>
<xml_diff>
--- a/book/manuscript/Kings-Playbook-Manuscript.docx
+++ b/book/manuscript/Kings-Playbook-Manuscript.docx
@@ -39069,6 +39069,94 @@
           <w:szCs w:val="22"/>
         </w:rPr>
         <w:t xml:space="preserve">This is his first book. It was written the way he runs businesses: short sentences, hard calls, no theater.</w:t>
+      </w:r>
+    </w:p>
+    <w:p>
+      <w:pPr>
+        <w:pStyle w:val="Heading1"/>
+        <w:pageBreakBefore/>
+        <w:spacing w:after="400" w:before="2000"/>
+        <w:jc w:val="center"/>
+      </w:pPr>
+      <w:r>
+        <w:rPr>
+          <w:rFonts w:ascii="Georgia" w:cs="Georgia" w:eastAsia="Georgia" w:hAnsi="Georgia"/>
+          <w:b/>
+          <w:bCs/>
+          <w:color w:val="1B1B73"/>
+          <w:sz w:val="40"/>
+          <w:szCs w:val="40"/>
+        </w:rPr>
+        <w:t xml:space="preserve">BACK COVER</w:t>
+      </w:r>
+    </w:p>
+    <w:p>
+      <w:pPr>
+        <w:spacing w:after="220"/>
+        <w:jc w:val="center"/>
+      </w:pPr>
+      <w:r>
+        <w:rPr>
+          <w:rFonts w:ascii="Georgia" w:cs="Georgia" w:eastAsia="Georgia" w:hAnsi="Georgia"/>
+          <w:i/>
+          <w:iCs/>
+          <w:color w:val="555555"/>
+          <w:sz w:val="24"/>
+          <w:szCs w:val="24"/>
+        </w:rPr>
+        <w:t xml:space="preserve">Leadership is not a set of skills. It is a set of obligations.</w:t>
+      </w:r>
+    </w:p>
+    <w:p>
+      <w:pPr>
+        <w:spacing w:after="220"/>
+        <w:jc w:val="center"/>
+      </w:pPr>
+      <w:r>
+        <w:rPr>
+          <w:rFonts w:ascii="Georgia" w:cs="Georgia" w:eastAsia="Georgia" w:hAnsi="Georgia"/>
+          <w:i/>
+          <w:iCs/>
+          <w:color w:val="555555"/>
+          <w:sz w:val="24"/>
+          <w:szCs w:val="24"/>
+        </w:rPr>
+        <w:t xml:space="preserve">Six arenas. Four laws each. One standard — drawn from the kings, generals, and builders whose work outlived them.</w:t>
+      </w:r>
+    </w:p>
+    <w:p>
+      <w:pPr>
+        <w:spacing w:after="220"/>
+        <w:jc w:val="center"/>
+      </w:pPr>
+      <w:r>
+        <w:rPr>
+          <w:rFonts w:ascii="Georgia" w:cs="Georgia" w:eastAsia="Georgia" w:hAnsi="Georgia"/>
+          <w:i/>
+          <w:iCs/>
+          <w:color w:val="555555"/>
+          <w:sz w:val="24"/>
+          <w:szCs w:val="24"/>
+        </w:rPr>
+        <w:t xml:space="preserve">The pendulum will keep swinging. You are no longer required to swing with it.</w:t>
+      </w:r>
+    </w:p>
+    <w:p>
+      <w:pPr>
+        <w:spacing w:before="300"/>
+        <w:jc w:val="center"/>
+      </w:pPr>
+      <w:r>
+        <w:rPr>
+          <w:rFonts w:ascii="Georgia" w:cs="Georgia" w:eastAsia="Georgia" w:hAnsi="Georgia"/>
+          <w:b/>
+          <w:bCs/>
+          <w:color w:val="8C6A1F"/>
+          <w:spacing w:val="40"/>
+          <w:sz w:val="20"/>
+          <w:szCs w:val="20"/>
+        </w:rPr>
+        <w:t xml:space="preserve">KING’S PLAYBOOK · AAYUSH VISHNOI</w:t>
       </w:r>
     </w:p>
     <w:sectPr>

</xml_diff>